<commit_message>
Atualiza templates de exclusividade
</commit_message>
<xml_diff>
--- a/templates/exclusividade_assinatura_digital.docx
+++ b/templates/exclusividade_assinatura_digital.docx
@@ -882,6 +882,7 @@
         </w:rPr>
         <w:t>{</w:t>
       </w:r>
+      <w:proofErr w:type="spellStart"/>
       <w:proofErr w:type="gramStart"/>
       <w:r>
         <w:rPr>
@@ -891,6 +892,7 @@
         </w:rPr>
         <w:t>cidade</w:t>
       </w:r>
+      <w:proofErr w:type="spellEnd"/>
       <w:proofErr w:type="gramEnd"/>
       <w:r>
         <w:rPr>
@@ -909,6 +911,7 @@
         </w:rPr>
         <w:t>/{</w:t>
       </w:r>
+      <w:proofErr w:type="spellStart"/>
       <w:proofErr w:type="gramEnd"/>
       <w:r>
         <w:rPr>
@@ -916,15 +919,34 @@
           <w:sz w:val="24"/>
           <w:szCs w:val="24"/>
         </w:rPr>
-        <w:t xml:space="preserve">estado}, {dia} </w:t>
+        <w:t>estado</w:t>
       </w:r>
+      <w:proofErr w:type="spellEnd"/>
       <w:r>
         <w:rPr>
           <w:rFonts w:asciiTheme="minorHAnsi" w:hAnsiTheme="minorHAnsi"/>
           <w:sz w:val="24"/>
           <w:szCs w:val="24"/>
         </w:rPr>
-        <w:t>de {</w:t>
+        <w:t>}, {</w:t>
+      </w:r>
+      <w:proofErr w:type="spellStart"/>
+      <w:r>
+        <w:rPr>
+          <w:rFonts w:asciiTheme="minorHAnsi" w:hAnsiTheme="minorHAnsi"/>
+          <w:sz w:val="24"/>
+          <w:szCs w:val="24"/>
+        </w:rPr>
+        <w:t>dia</w:t>
+      </w:r>
+      <w:proofErr w:type="spellEnd"/>
+      <w:r>
+        <w:rPr>
+          <w:rFonts w:asciiTheme="minorHAnsi" w:hAnsiTheme="minorHAnsi"/>
+          <w:sz w:val="24"/>
+          <w:szCs w:val="24"/>
+        </w:rPr>
+        <w:t>} de {</w:t>
       </w:r>
       <w:proofErr w:type="spellStart"/>
       <w:r>
@@ -975,6 +997,119 @@
     </w:p>
     <w:p>
       <w:pPr>
+        <w:pStyle w:val="SemEspaamento"/>
+        <w:jc w:val="center"/>
+        <w:rPr>
+          <w:b/>
+          <w:sz w:val="24"/>
+          <w:szCs w:val="24"/>
+        </w:rPr>
+      </w:pPr>
+    </w:p>
+    <w:p>
+      <w:pPr>
+        <w:pStyle w:val="SemEspaamento"/>
+        <w:jc w:val="center"/>
+        <w:rPr>
+          <w:sz w:val="24"/>
+          <w:szCs w:val="24"/>
+        </w:rPr>
+      </w:pPr>
+      <w:r>
+        <w:rPr>
+          <w:sz w:val="24"/>
+          <w:szCs w:val="24"/>
+        </w:rPr>
+        <w:t>{{USUARIO_ASSINATURA_DIGITAL}}</w:t>
+      </w:r>
+      <w:r>
+        <w:rPr>
+          <w:sz w:val="24"/>
+          <w:szCs w:val="24"/>
+        </w:rPr>
+        <w:br/>
+      </w:r>
+      <w:r>
+        <w:rPr>
+          <w:sz w:val="24"/>
+          <w:szCs w:val="24"/>
+        </w:rPr>
+        <w:br/>
+      </w:r>
+    </w:p>
+    <w:p>
+      <w:pPr>
+        <w:pStyle w:val="SemEspaamento"/>
+        <w:jc w:val="center"/>
+        <w:rPr>
+          <w:b/>
+          <w:sz w:val="24"/>
+          <w:szCs w:val="24"/>
+        </w:rPr>
+      </w:pPr>
+      <w:r>
+        <w:rPr>
+          <w:b/>
+          <w:sz w:val="24"/>
+          <w:szCs w:val="24"/>
+        </w:rPr>
+        <w:t>{NOME_PAPEL_CONTRATADO} - {contratado}</w:t>
+      </w:r>
+    </w:p>
+    <w:p>
+      <w:pPr>
+        <w:pStyle w:val="SemEspaamento"/>
+        <w:jc w:val="center"/>
+        <w:rPr>
+          <w:b/>
+          <w:sz w:val="24"/>
+          <w:szCs w:val="24"/>
+        </w:rPr>
+      </w:pPr>
+      <w:r>
+        <w:rPr>
+          <w:b/>
+          <w:sz w:val="24"/>
+          <w:szCs w:val="24"/>
+        </w:rPr>
+        <w:t>CPF nº {cpf_contratado}</w:t>
+      </w:r>
+    </w:p>
+    <w:p>
+      <w:pPr>
+        <w:pStyle w:val="SemEspaamento"/>
+        <w:jc w:val="center"/>
+        <w:rPr>
+          <w:b/>
+          <w:sz w:val="24"/>
+          <w:szCs w:val="24"/>
+        </w:rPr>
+      </w:pPr>
+    </w:p>
+    <w:p>
+      <w:pPr>
+        <w:pStyle w:val="SemEspaamento"/>
+        <w:jc w:val="center"/>
+        <w:rPr>
+          <w:b/>
+          <w:sz w:val="24"/>
+          <w:szCs w:val="24"/>
+        </w:rPr>
+      </w:pPr>
+    </w:p>
+    <w:p>
+      <w:pPr>
+        <w:pStyle w:val="SemEspaamento"/>
+        <w:jc w:val="center"/>
+        <w:rPr>
+          <w:b/>
+          <w:sz w:val="24"/>
+          <w:szCs w:val="24"/>
+        </w:rPr>
+      </w:pPr>
+    </w:p>
+    <w:p>
+      <w:pPr>
         <w:jc w:val="center"/>
         <w:rPr>
           <w:rFonts w:asciiTheme="minorHAnsi" w:hAnsiTheme="minorHAnsi"/>
@@ -988,7 +1123,7 @@
           <w:sz w:val="24"/>
           <w:szCs w:val="24"/>
         </w:rPr>
-        <w:t>{{USUARIO_ASSINATURA_DIGITAL}}</w:t>
+        <w:t>{{CONTRATANTE_ASSINATURA_DIGITAL}}</w:t>
       </w:r>
     </w:p>
     <w:p>
@@ -1054,108 +1189,28 @@
           <w:sz w:val="24"/>
           <w:szCs w:val="24"/>
         </w:rPr>
-        <w:t>CPF nº {cpf_contratante}</w:t>
+        <w:t>CPF nº {</w:t>
       </w:r>
-    </w:p>
-    <w:p>
-      <w:pPr>
-        <w:pStyle w:val="SemEspaamento"/>
-        <w:jc w:val="center"/>
-        <w:rPr>
-          <w:b/>
-          <w:sz w:val="24"/>
-          <w:szCs w:val="24"/>
-        </w:rPr>
-      </w:pPr>
-    </w:p>
-    <w:p>
-      <w:pPr>
-        <w:pStyle w:val="SemEspaamento"/>
-        <w:jc w:val="center"/>
-        <w:rPr>
-          <w:b/>
-          <w:sz w:val="24"/>
-          <w:szCs w:val="24"/>
-        </w:rPr>
-      </w:pPr>
-      <w:bookmarkStart w:id="0" w:name="_GoBack"/>
-      <w:bookmarkEnd w:id="0"/>
-    </w:p>
-    <w:p>
-      <w:pPr>
-        <w:pStyle w:val="SemEspaamento"/>
-        <w:jc w:val="center"/>
-        <w:rPr>
-          <w:sz w:val="24"/>
-          <w:szCs w:val="24"/>
-        </w:rPr>
-      </w:pPr>
-      <w:r>
-        <w:rPr>
-          <w:sz w:val="24"/>
-          <w:szCs w:val="24"/>
-        </w:rPr>
-        <w:t>{{USUARIO_ASSINATURA_DIGITAL}</w:t>
-      </w:r>
-      <w:r>
-        <w:rPr>
-          <w:sz w:val="24"/>
-          <w:szCs w:val="24"/>
-        </w:rPr>
-        <w:t>}</w:t>
-      </w:r>
-      <w:r>
-        <w:rPr>
-          <w:sz w:val="24"/>
-          <w:szCs w:val="24"/>
-        </w:rPr>
-        <w:br/>
-      </w:r>
-      <w:r>
-        <w:rPr>
-          <w:sz w:val="24"/>
-          <w:szCs w:val="24"/>
-        </w:rPr>
-        <w:br/>
-      </w:r>
-    </w:p>
-    <w:p>
-      <w:pPr>
-        <w:pStyle w:val="SemEspaamento"/>
-        <w:jc w:val="center"/>
-        <w:rPr>
-          <w:b/>
-          <w:sz w:val="24"/>
-          <w:szCs w:val="24"/>
-        </w:rPr>
-      </w:pPr>
+      <w:proofErr w:type="spellStart"/>
       <w:r>
         <w:rPr>
           <w:b/>
           <w:sz w:val="24"/>
           <w:szCs w:val="24"/>
         </w:rPr>
-        <w:t>{NOME_PAPEL_CONTRATADO} - {contratado}</w:t>
+        <w:t>cpf_contratante</w:t>
       </w:r>
-    </w:p>
-    <w:p>
-      <w:pPr>
-        <w:pStyle w:val="SemEspaamento"/>
-        <w:jc w:val="center"/>
-        <w:rPr>
-          <w:b/>
-          <w:sz w:val="24"/>
-          <w:szCs w:val="24"/>
-        </w:rPr>
-      </w:pPr>
+      <w:proofErr w:type="spellEnd"/>
       <w:r>
         <w:rPr>
           <w:b/>
           <w:sz w:val="24"/>
           <w:szCs w:val="24"/>
         </w:rPr>
-        <w:t>CPF nº {cpf_contratado}</w:t>
+        <w:t>}</w:t>
       </w:r>
+      <w:bookmarkStart w:id="0" w:name="_GoBack"/>
+      <w:bookmarkEnd w:id="0"/>
     </w:p>
     <w:sectPr>
       <w:headerReference w:type="first" r:id="rId9"/>
@@ -25681,7 +25736,7 @@
 </file>
 
 <file path=customXml/itemProps1.xml><?xml version="1.0" encoding="utf-8"?>
-<ds:datastoreItem xmlns:ds="http://schemas.openxmlformats.org/officeDocument/2006/customXml" ds:itemID="{3020ADA2-1DAD-49E1-8F15-8D1CEB628DD1}">
+<ds:datastoreItem xmlns:ds="http://schemas.openxmlformats.org/officeDocument/2006/customXml" ds:itemID="{6E534AB0-2799-4416-9CF7-AE909865526F}">
   <ds:schemaRefs>
     <ds:schemaRef ds:uri="http://schemas.openxmlformats.org/officeDocument/2006/bibliography"/>
   </ds:schemaRefs>

</xml_diff>

<commit_message>
fix(templates): reconhece CPF x CNPJ automaticamente, remove '(MF)' e duplicidade
Nos 5 templates de contrato de exclusividade, o texto de qualificação
das partes trazia 'CPF(MF) Nº' (contratante) e 'CPF(MF) ou CNPJ(MF)'
(contratado) fixos, independente do documento real da parte ser
pessoa física ou jurídica.

- Adiciona getDocLabel() em dataTagsProcessor.ts: detecta CPF (11
  dígitos) vs CNPJ (14 dígitos) pelo próprio valor cadastrado e gera
  o rótulo certo ('CPF Nº' ou 'CNPJ Nº').
- Novas tags {doc_label_contratante} e {doc_label_contratado},
  preenchidas dinamicamente a partir do cadastro da parte.
- Templates .docx (linha de qualificação + linha do carimbo de
  assinatura) trocam o texto fixo 'CPF(MF) [ou CNPJ(MF)]' pela tag
  dinâmica, sem alterar mais nada da formatação/estrutura do arquivo
  (edição feita run a run, preservando fontes/negrito originais).
</commit_message>
<xml_diff>
--- a/templates/exclusividade_assinatura_digital.docx
+++ b/templates/exclusividade_assinatura_digital.docx
@@ -35,7 +35,7 @@
           <w:sz w:val="24"/>
           <w:szCs w:val="24"/>
         </w:rPr>
-        <w:t>CPF(</w:t>
+        <w:t>{doc_label_contratante}: {cpf_contratante}</w:t>
       </w:r>
       <w:proofErr w:type="gramEnd"/>
       <w:r>
@@ -44,7 +44,7 @@
           <w:sz w:val="24"/>
           <w:szCs w:val="24"/>
         </w:rPr>
-        <w:t>MF) Nº: {cpf_contratante}, IDENTIDADE Nº: {rg_contratante}, ENDEREÇO: {endereco_contratante}.</w:t>
+        <w:t>, IDENTIDADE Nº: {rg_contratante}, ENDEREÇO: {endereco_contratante}.</w:t>
       </w:r>
     </w:p>
     <w:p>
@@ -117,7 +117,7 @@
           <w:sz w:val="24"/>
           <w:szCs w:val="24"/>
         </w:rPr>
-        <w:t>CPF(</w:t>
+        <w:t>{doc_label_contratado}: {cpf_contratado}</w:t>
       </w:r>
       <w:proofErr w:type="gramEnd"/>
       <w:r>
@@ -126,7 +126,6 @@
           <w:sz w:val="24"/>
           <w:szCs w:val="24"/>
         </w:rPr>
-        <w:t xml:space="preserve">MF) </w:t>
       </w:r>
       <w:proofErr w:type="spellStart"/>
       <w:r>
@@ -135,7 +134,6 @@
           <w:sz w:val="24"/>
           <w:szCs w:val="24"/>
         </w:rPr>
-        <w:t>ou</w:t>
       </w:r>
       <w:proofErr w:type="spellEnd"/>
       <w:r>
@@ -144,7 +142,7 @@
           <w:sz w:val="24"/>
           <w:szCs w:val="24"/>
         </w:rPr>
-        <w:t xml:space="preserve"> CNPJ(MF): {cpf_contratado}, CRECI Nº: {creci_contratado}, ENDEREÇO: {endereco_contratado}, TELEFONES: {telefone_contratado}.</w:t>
+        <w:t>, CRECI Nº: {creci_contratado}, ENDEREÇO: {endereco_contratado}, TELEFONES: {telefone_contratado}.</w:t>
       </w:r>
     </w:p>
     <w:p>
@@ -1072,7 +1070,7 @@
           <w:sz w:val="24"/>
           <w:szCs w:val="24"/>
         </w:rPr>
-        <w:t>CPF nº {cpf_contratado}</w:t>
+        <w:t>{doc_label_contratado} {cpf_contratado}</w:t>
       </w:r>
     </w:p>
     <w:p>
@@ -1189,7 +1187,7 @@
           <w:sz w:val="24"/>
           <w:szCs w:val="24"/>
         </w:rPr>
-        <w:t>CPF nº {</w:t>
+        <w:t>{doc_label_contratante} {cpf_contratante}</w:t>
       </w:r>
       <w:proofErr w:type="spellStart"/>
       <w:r>
@@ -1198,7 +1196,6 @@
           <w:sz w:val="24"/>
           <w:szCs w:val="24"/>
         </w:rPr>
-        <w:t>cpf_contratante</w:t>
       </w:r>
       <w:proofErr w:type="spellEnd"/>
       <w:r>
@@ -1207,7 +1204,6 @@
           <w:sz w:val="24"/>
           <w:szCs w:val="24"/>
         </w:rPr>
-        <w:t>}</w:t>
       </w:r>
       <w:bookmarkStart w:id="0" w:name="_GoBack"/>
       <w:bookmarkEnd w:id="0"/>

</xml_diff>